<commit_message>
Módulo SPDA conforme ABNT NBR 5419:2026
- Análise de risco (Parte 2): AD, AM, ND, NM, NL, NI; componentes RA a RZ;
  R1, R3 e frequência de danos F aos sistemas internos; combinações de
  nível de proteção e DPS com o nível mínimo exigido.
- Projeto (Parte 3): NP I a IV, captação em malha ou captores Franklin
  (ângulo equivalente à esfera rolante, sugestão de mastros), descidas,
  anéis, aterramento em anel (arranjo B) com l1 e eletrodos adicionais,
  distância de segurança, materiais e inspeção.
- DPS (Parte 4): Iimp por modo do DPS classe I; quadro de entrada com DPS
  classe I+II nos diagramas e na lista de materiais.
- Seção SPDA no menu Sistemas, memorial PDF/Word/HTML com planta,
  elevação e gráfico de risco, tabela de referência, memorial descritivo
  e exemplo; testes do motor e do navegador.

Co-Authored-By: Claude Opus 5.5 <noreply@anthropic.com>
Claude-Session: https://claude.ai/code/session_01E4Px4gvzC9MkKBX1rn21ys
</commit_message>
<xml_diff>
--- a/exemplo/diagramas-quadros-residencia-unifamiliar-exemplo-r00.docx
+++ b/exemplo/diagramas-quadros-residencia-unifamiliar-exemplo-r00.docx
@@ -483,7 +483,7 @@
                 <w:szCs w:val="19"/>
                 <w:rFonts w:ascii="Calibri" w:cs="Calibri" w:eastAsia="Calibri" w:hAnsi="Calibri"/>
               </w:rPr>
-              <w:t xml:space="preserve">26/10/2026 — R00</w:t>
+              <w:t xml:space="preserve">27/10/2026 — R00</w:t>
             </w:r>
           </w:p>
         </w:tc>
@@ -927,7 +927,7 @@
                 <w:szCs w:val="17"/>
                 <w:rFonts w:ascii="Calibri" w:cs="Calibri" w:eastAsia="Calibri" w:hAnsi="Calibri"/>
               </w:rPr>
-              <w:t xml:space="preserve">Classe II, Uc 175 V, In 20 kA — 3 fase(s) e neutro ao PE</w:t>
+              <w:t xml:space="preserve">Classe I+II, Iimp 12,5 kA (10/350 µs), Uc 175 V, In 20 kA — 3 fase(s) e neutro ao PE</w:t>
             </w:r>
           </w:p>
         </w:tc>
@@ -4753,7 +4753,7 @@
           <w:szCs w:val="20"/>
           <w:rFonts w:ascii="Calibri" w:cs="Calibri" w:eastAsia="Calibri" w:hAnsi="Calibri"/>
         </w:rPr>
-        <w:t xml:space="preserve">Cidade – UF, 26 de outubro de 2026</w:t>
+        <w:t xml:space="preserve">Cidade – UF, 27 de outubro de 2026</w:t>
       </w:r>
     </w:p>
     <w:p>
@@ -4923,7 +4923,7 @@
         <w:szCs w:val="15"/>
         <w:rFonts w:ascii="Calibri" w:cs="Calibri" w:eastAsia="Calibri" w:hAnsi="Calibri"/>
       </w:rPr>
-      <w:t xml:space="preserve">	R00 · 26/10/2026</w:t>
+      <w:t xml:space="preserve">	R00 · 27/10/2026</w:t>
     </w:r>
   </w:p>
 </w:hdr>

</xml_diff>

<commit_message>
Motor de DPS por quadro e NG do Anexo F só no motor de cálculo
- Nova seção Instalações › Proteção contra surtos (DPS): classe, ligação
  pelo esquema de aterramento (n+0 ou n+1 com centelhador N–PE), Uc
  (Tabela 49), Up ≤ categoria II (Tabela 31), nível efetivo Up/f,
  In/Imáx pela exposição (faixas usuais de fabricantes), Iimp pelo nível
  do SPDA, condutores de ligação, retaguarda, Isccr, coordenação e
  DPS classe III.
- Memória de cálculo do DPS (PDF, Word, HTML), anexável ao memorial
  descritivo; diagramas com a especificação e o desenho da ligação n+1;
  lista de materiais pelo motor; tabela de referência em Tabelas.
- Memorial do SPDA cita só o município escolhido; a tabela do Anexo F
  (MS) permanece no motor de cálculo.
- Testes do motor e do navegador.

Co-Authored-By: Claude Opus 5.5 <noreply@anthropic.com>
Claude-Session: https://claude.ai/code/session_01E4Px4gvzC9MkKBX1rn21ys
</commit_message>
<xml_diff>
--- a/exemplo/diagramas-quadros-residencia-unifamiliar-exemplo-r00.docx
+++ b/exemplo/diagramas-quadros-residencia-unifamiliar-exemplo-r00.docx
@@ -927,7 +927,7 @@
                 <w:szCs w:val="17"/>
                 <w:rFonts w:ascii="Calibri" w:cs="Calibri" w:eastAsia="Calibri" w:hAnsi="Calibri"/>
               </w:rPr>
-              <w:t xml:space="preserve">Classe I+II, Iimp 12,5 kA (10/350 µs), Uc 175 V, In 20 kA — 3 fase(s) e neutro ao PE</w:t>
+              <w:t xml:space="preserve">Classe I+II, Iimp 12,5 kA (10/350 µs), Uc 175 V, In 20 kA, Up ≤ 1,5 kV — 4+0 — fases e neutro ao PE</w:t>
             </w:r>
           </w:p>
         </w:tc>
@@ -1825,7 +1825,7 @@
                 <w:szCs w:val="17"/>
                 <w:rFonts w:ascii="Calibri" w:cs="Calibri" w:eastAsia="Calibri" w:hAnsi="Calibri"/>
               </w:rPr>
-              <w:t xml:space="preserve">Classe II, Uc 175 V, In 20 kA — 3 fase(s) e neutro ao PE</w:t>
+              <w:t xml:space="preserve">Classe II, Uc 175 V, In 20 kA, Up ≤ 1,2 kV — 4+0 — fases e neutro ao PE</w:t>
             </w:r>
           </w:p>
         </w:tc>

</xml_diff>